<commit_message>
Deploy preview for PR 698 🛫
</commit_message>
<xml_diff>
--- a/pr-preview/pr-698/vignettes/articles/version-crosswalk-1.3-to-1.4.docx
+++ b/pr-preview/pr-698/vignettes/articles/version-crosswalk-1.3-to-1.4.docx
@@ -23,7 +23,7 @@
         <w:pStyle w:val="Date"/>
       </w:pPr>
       <w:r>
-        <w:t xml:space="preserve">2026-10-16</w:t>
+        <w:t xml:space="preserve">2026-10-29</w:t>
       </w:r>
     </w:p>
     <w:bookmarkStart w:id="9" w:name="overview"/>
@@ -3049,7 +3049,7 @@
         <w:rPr>
           <w:rStyle w:val="CommentTok"/>
         </w:rPr>
-        <w:t xml:space="preserve">#&gt;     age id    antigen_iso    value</w:t>
+        <w:t xml:space="preserve">#&gt;     age id    antigen_iso value</w:t>
       </w:r>
       <w:r>
         <w:br/>
@@ -3058,7 +3058,7 @@
         <w:rPr>
           <w:rStyle w:val="CommentTok"/>
         </w:rPr>
-        <w:t xml:space="preserve">#&gt;   &lt;dbl&gt; &lt;chr&gt; &lt;chr&gt;          &lt;dbl&gt;</w:t>
+        <w:t xml:space="preserve">#&gt;   &lt;dbl&gt; &lt;chr&gt; &lt;chr&gt;       &lt;dbl&gt;</w:t>
       </w:r>
       <w:r>
         <w:br/>
@@ -3067,7 +3067,7 @@
         <w:rPr>
           <w:rStyle w:val="CommentTok"/>
         </w:rPr>
-        <w:t xml:space="preserve">#&gt; 1  19.1 1     HlyE_IgA      92.8  </w:t>
+        <w:t xml:space="preserve">#&gt; 1 17.5  1     HlyE_IgA    0.251</w:t>
       </w:r>
       <w:r>
         <w:br/>
@@ -3076,7 +3076,7 @@
         <w:rPr>
           <w:rStyle w:val="CommentTok"/>
         </w:rPr>
-        <w:t xml:space="preserve">#&gt; 2  19.1 1     HlyE_IgG    5028.   </w:t>
+        <w:t xml:space="preserve">#&gt; 2 17.5  1     HlyE_IgG    0.641</w:t>
       </w:r>
       <w:r>
         <w:br/>
@@ -3085,7 +3085,7 @@
         <w:rPr>
           <w:rStyle w:val="CommentTok"/>
         </w:rPr>
-        <w:t xml:space="preserve">#&gt; 3  16.5 2     HlyE_IgA      13.8  </w:t>
+        <w:t xml:space="preserve">#&gt; 3 14.3  2     HlyE_IgA    1.21 </w:t>
       </w:r>
       <w:r>
         <w:br/>
@@ -3094,7 +3094,7 @@
         <w:rPr>
           <w:rStyle w:val="CommentTok"/>
         </w:rPr>
-        <w:t xml:space="preserve">#&gt; 4  16.5 2     HlyE_IgG      42.9  </w:t>
+        <w:t xml:space="preserve">#&gt; 4 14.3  2     HlyE_IgG    0.854</w:t>
       </w:r>
       <w:r>
         <w:br/>
@@ -3103,7 +3103,7 @@
         <w:rPr>
           <w:rStyle w:val="CommentTok"/>
         </w:rPr>
-        <w:t xml:space="preserve">#&gt; 5  11.7 3     HlyE_IgA       0.970</w:t>
+        <w:t xml:space="preserve">#&gt; 5  2.34 3     HlyE_IgA    0.559</w:t>
       </w:r>
       <w:r>
         <w:br/>
@@ -3112,7 +3112,7 @@
         <w:rPr>
           <w:rStyle w:val="CommentTok"/>
         </w:rPr>
-        <w:t xml:space="preserve">#&gt; 6  11.7 3     HlyE_IgG       2.30</w:t>
+        <w:t xml:space="preserve">#&gt; 6  2.34 3     HlyE_IgG    0.303</w:t>
       </w:r>
       <w:r>
         <w:br/>

</xml_diff>